<commit_message>
Update website to doc 3 universal contract, remove certificate booking, update exam form & letter templates
</commit_message>
<xml_diff>
--- a/.deploy/statement-reply-release-20261018-01/after/backend/app/data/contracts/01_სერტიფიკაციის_სქემა.docx
+++ b/.deploy/statement-reply-release-20261018-01/after/backend/app/data/contracts/01_სერტიფიკაციის_სქემა.docx
@@ -642,7 +642,7 @@
           <w:color w:val="000000"/>
           <w:sz w:val="21"/>
         </w:rPr>
-        <w:t xml:space="preserve"> სერტიფიცირების სავალდებულო მოთხოვნიდან გამონაკლისები — მათ შორის, V კლასის (განსაკუთრებული მნიშვნელობის) შენობა-ნაგებობებსა და კულტურული მემკვიდრეობის უძრავ ძეგლებზე (დადგენილების მე-7 მუხლი), საერთაშორისო საფინანსო ინსტიტუტების მიერ დაფინანსებულ პროექტებსა და ევროკავშირის/OECD-ის წევრ ქვეყნებში ავტორიზებულ პირებზე (დადგენილების მე-3 მუხლი), აგრეთვე 2026 წლის 1 სექტემბრამდე შეთანხმებული პროექტების კორექტირებაზე (დადგენილების მე-6 მუხლი) — განისაზღვრება საქართველოს მთავრობის 2024 წლის 10 აპრილის №134 დადგენილებითა და მოქმედი კანონმდებლობით.</w:t>
+        <w:t xml:space="preserve"> სერტიფიცირების სავალდებულო მოთხოვნიდან გამონაკლისები — მათ შორის, V კლასის (განსაკუთრებული მნიშვნელობის) შენობა-ნაგებობებსა და კულტურული მემკვიდრეობის უძრავ ძეგლებზე (დადგენილების მე-7 მუხლი), საერთაშორისო საფინანსო ინსტიტუტების მიერ დაფინანსებულ პროექტებსა და ევროკავშირის/OECD-ის წევრ ქვეყნებში ავტორიზებულ პირებზე (დადგენილების მე-3 მუხლი), აგრეთვე 2026 წლის 20 დეკემბრამდე შეთანხმებული პროექტების კორექტირებაზე (დადგენილების მე-6 მუხლი) — განისაზღვრება საქართველოს მთავრობის 2024 წლის 10 აპრილის №134 დადგენილებითა და მოქმედი კანონმდებლობით.</w:t>
       </w:r>
     </w:p>
     <w:p>
@@ -915,7 +915,7 @@
           <w:color w:val="000000"/>
           <w:sz w:val="21"/>
         </w:rPr>
-        <w:t xml:space="preserve"> გარდამავალი წესით (უმაღლესი არქიტექტურული განათლების დიპლომის წარმოდგენის გარეშე) სერტიფიცირებულ პირთან ფორმდება შესაბამისი საგამონაკლისო/გარდამავალი სასერტიფიკაციო ხელშეკრულება (</w:t>
+        <w:t xml:space="preserve"> გარდამავალი წესით (უმაღლესი არქიტექტურული განათლების დიპლომის წარმოდგენის გარეშე) სერტიფიცირებულ პირზე გაიცემა სტანდარტული ფორმის სერტიფიკატი (5-წლიანი სასერტიფიკაციო ციკლით — წესის მე-2 მუხლის მე-3 პუნქტი) ერთიანი საგამოცდო და სასერტიფიკაციო ხელშეკრულებით განსაზღვრული იმ სავალდებულო სახელშეკრულებო პირობით, რომ პირი კანონმდებლობით დადგენილი გარდამავალი ვადის (</w:t>
       </w:r>
       <w:r>
         <w:rPr>
@@ -925,7 +925,7 @@
           <w:color w:val="000000"/>
           <w:sz w:val="21"/>
         </w:rPr>
-        <w:t>GIPC-CON-001 (გარდამავალი)</w:t>
+        <w:t>2029 წლის 1 იანვარი</w:t>
       </w:r>
       <w:r>
         <w:rPr>
@@ -935,47 +935,7 @@
           <w:color w:val="000000"/>
           <w:sz w:val="21"/>
         </w:rPr>
-        <w:t xml:space="preserve"> ან </w:t>
-      </w:r>
-      <w:r>
-        <w:rPr>
-          <w:rFonts w:ascii="Sylfaen" w:hAnsi="Sylfaen" w:cs="Sylfaen" w:eastAsia="Sylfaen"/>
-          <w:b/>
-          <w:i w:val="0"/>
-          <w:color w:val="000000"/>
-          <w:sz w:val="21"/>
-        </w:rPr>
-        <w:t>GIPC-CON-002 (გარდამავალი)</w:t>
-      </w:r>
-      <w:r>
-        <w:rPr>
-          <w:rFonts w:ascii="Sylfaen" w:hAnsi="Sylfaen" w:cs="Sylfaen" w:eastAsia="Sylfaen"/>
-          <w:b w:val="0"/>
-          <w:i w:val="0"/>
-          <w:color w:val="000000"/>
-          <w:sz w:val="21"/>
-        </w:rPr>
-        <w:t>) და გაიცემა სტანდარტული ფორმის სერტიფიკატი (5-წლიანი სასერტიფიკაციო ციკლით — წესის მე-2 მუხლის მე-3 პუნქტი) იმ სავალდებულო სახელშეკრულებო პირობით, რომ პირი კანონმდებლობით დადგენილი გარდამავალი ვადის (</w:t>
-      </w:r>
-      <w:r>
-        <w:rPr>
-          <w:rFonts w:ascii="Sylfaen" w:hAnsi="Sylfaen" w:cs="Sylfaen" w:eastAsia="Sylfaen"/>
-          <w:b/>
-          <w:i w:val="0"/>
-          <w:color w:val="000000"/>
-          <w:sz w:val="21"/>
-        </w:rPr>
-        <w:t>2029 წლის 1 იანვარი</w:t>
-      </w:r>
-      <w:r>
-        <w:rPr>
-          <w:rFonts w:ascii="Sylfaen" w:hAnsi="Sylfaen" w:cs="Sylfaen" w:eastAsia="Sylfaen"/>
-          <w:b w:val="0"/>
-          <w:i w:val="0"/>
-          <w:color w:val="000000"/>
-          <w:sz w:val="21"/>
-        </w:rPr>
-        <w:t xml:space="preserve">, ხოლო სახელმწიფოს მიერ ვადის ოფიციალურად გადაწევის შემთხვევაში — ახალი საკანონმდებლო თარიღი) ამოწურვამდე წარადგენს უმაღლესი არქიტექტურული განათლების დიპლომს. დიპლომის გარდამავალ ვადამდე წარდგენისას სერტიფიკატს ეხსნება საგამონაკლისო შეზღუდვა და იგი უწყვეტად აგრძელებს მოქმედებას სრული 5-წლიანი ციკლის ამოწურვამდე (დამატებითი გამოცდისა და საფასურის გარეშე), ხოლო დიპლომის წარუდგენლობის შემთხვევაში გარდამავალი თარიღის დადგომისთანავე იწურება სერტიფიკატის მოქმედების საგამონაკლისო ვადა და სერტიფიკატი </w:t>
+        <w:t xml:space="preserve">, ხოლო სახელმწიფოს მიერ ვადის ოფიციალურად გადაწევის შემთხვევაში — შესაბამისი ნორმატიული აქტით/გარდამავალი დებულებით განსაზღვრული ახალი საკანონმდებლო თარიღი) ამოწურვამდე წარადგენს უმაღლესი არქიტექტურული განათლების დიპლომს. გარდამავალ ვადამდე დიპლომის წარდგენისა და სტანდარტული რეჟიმის წინაპირობებთან (§4.1, მოქმედი კანონმდებლობის მოთხოვნათა გათვალისწინებით) შესაბამისობის დოკუმენტური დადასტურების (სერტიფიცირების გადაწყვეტილების განახლების) საფუძველზე სერტიფიკატს ეხსნება საგამონაკლისო შეზღუდვა და იგი უწყვეტად აგრძელებს მოქმედებას თავდაპირველი 5-წლიანი სასერტიფიკაციო ციკლის ამოწურვამდე (დამატებითი გამოცდისა და საფასურის გარეშე), ხოლო დიპლომის წარუდგენლობის შემთხვევაში გარდამავალი თარიღის დადგომისთანავე იწურება სერტიფიკატის მოქმედების საგამონაკლისო ვადა და სერტიფიკატი </w:t>
       </w:r>
       <w:r>
         <w:rPr>
@@ -1190,7 +1150,7 @@
           <w:color w:val="000000"/>
           <w:sz w:val="21"/>
         </w:rPr>
-        <w:t>. საფასური გადაიხდება ერთჯერადად უნაღდო ანგარიშსწორებით, გამოცდის წარმატებით ჩაბარებისა და დადებითი სასერტიფიკაციო გადაწყვეტილების მიღების შემდეგ, სასერტიფიკაციო ხელშეკრულების გაფორმებამდე. მხოლოდ გამოცდის ჩაბარება არ წარმოშობს სერტიფიკატის გაცემის საფასურის გადახდის ვალდებულებას.</w:t>
+        <w:t>. საფასური გადაიხდება ერთჯერადად უნაღდო ანგარიშსწორებით, მხოლოდ გამოცდის წარმატებით ჩაბარებისა და დადებითი სასერტიფიკაციო გადაწყვეტილების მიღების შემდეგ (შეტყობინებიდან 1 თვის ვადაში), რის საფუძველზეც ძალაში შედის გამოცდის დღეს ხელმოწერილი ერთიანი ხელშეკრულების სასერტიფიკაციო ნაწილი და გაიცემა სერტიფიკატი. მხოლოდ გამოცდის ჩაბარება არ წარმოშობს სერტიფიკატის გაცემის საფასურის გადახდის ვალდებულებას.</w:t>
       </w:r>
     </w:p>
     <w:p>
@@ -6935,7 +6895,7 @@
           <w:color w:val="000000"/>
           <w:sz w:val="21"/>
         </w:rPr>
-        <w:t>სერტიფიცირების პროცესი მოიცავს განაცხადის წარდგენასა და დაშვების წინაპირობების შემოწმებას, სასერტიფიკაციო გამოცდის ჩაბარებას, გამოცდის შედეგისა და სერტიფიცირების გადაწყვეტილების შეტყობინებას, სასერტიფიკაციო ხელშეკრულების გაფორმებასა და სერტიფიკატის გაცემას (საჯარო რეესტრში გააქტიურებას).</w:t>
+        <w:t>სერტიფიცირების პროცესი მოიცავს განაცხადის წარდგენასა და დაშვების წინაპირობების შემოწმებას, გამოცდის დღეს ერთიანი საგამოცდო და სასერტიფიკაციო ხელშეკრულების გაფორმებასა და სასერტიფიკაციო გამოცდის ჩაბარებას, გამოცდის შედეგისა და სერტიფიცირების გადაწყვეტილების შეტყობინებას, სერტიფიკატის გაცემის საფასურის გადახდასა და სერტიფიკატის გაცემას (საჯარო რეესტრში გააქტიურებას).</w:t>
       </w:r>
     </w:p>
     <w:p>
@@ -7100,7 +7060,27 @@
           <w:color w:val="000000"/>
           <w:sz w:val="21"/>
         </w:rPr>
-        <w:t xml:space="preserve"> ვადაში ამოწმებს წარდგენილი დოკუმენტების სისრულესა და საკვალიფიკაციო მოთხოვნებთან შესაბამისობას. არასრული დოკუმენტაციის ან მცდარი ინფორმაციის წარდგენა განაცხადის უარყოფის (გამოცდაზე არდაშვების) საფუძველია (№134 დადგენილების მე-4 მუხლის მე-6 პუნქტი). გამოცდაზე დაშვების დადასტურების შემდეგ კანდიდატს ეცნობება გამოცდის თარიღი, დრო და საფასურის გადახდის რეკვიზიტები.</w:t>
+        <w:t xml:space="preserve"> ვადაში ამოწმებს წარდგენილი დოკუმენტების სისრულესა და საკვალიფიკაციო მოთხოვნებთან შესაბამისობას. თუ წარდგენილი დოკუმენტაცია არასრულია ან ხარვეზიანია, ინსტიტუტი კანდიდატს ხარვეზის აღმოსაფხვრელად განუსაზღვრავს გონივრულ ვადას (</w:t>
+      </w:r>
+      <w:r>
+        <w:rPr>
+          <w:rFonts w:ascii="Sylfaen" w:hAnsi="Sylfaen" w:cs="Sylfaen" w:eastAsia="Sylfaen"/>
+          <w:b/>
+          <w:i w:val="0"/>
+          <w:color w:val="000000"/>
+          <w:sz w:val="21"/>
+        </w:rPr>
+        <w:t>5 სამუშაო დღეს</w:t>
+      </w:r>
+      <w:r>
+        <w:rPr>
+          <w:rFonts w:ascii="Sylfaen" w:hAnsi="Sylfaen" w:cs="Sylfaen" w:eastAsia="Sylfaen"/>
+          <w:b w:val="0"/>
+          <w:i w:val="0"/>
+          <w:color w:val="000000"/>
+          <w:sz w:val="21"/>
+        </w:rPr>
+        <w:t xml:space="preserve"> — №134 დადგენილების მე-4 მუხლის მე-7 პუნქტი); დადგენილ ვადაში ხარვეზის აღმოუფხვრელობა, საკვალიფიკაციო წინაპირობების დაუკმაყოფილებლობა ან მცდარი ინფორმაციის წარდგენა განაცხადის უარყოფის (გამოცდაზე არდაშვების) საფუძველია (№134 დადგენილების მე-4 მუხლის მე-6 და მე-7 პუნქტები). გამოცდაზე დაშვების დადასტურების შემდეგ კანდიდატს ეცნობება გამოცდის თარიღი, დრო და საფასურის გადახდის რეკვიზიტები.</w:t>
       </w:r>
     </w:p>
     <w:p>
@@ -7126,7 +7106,7 @@
           <w:color w:val="000000"/>
           <w:sz w:val="21"/>
         </w:rPr>
-        <w:t>საგამოცდო საფასური და ხელშეკრულება:</w:t>
+        <w:t>საგამოცდო საფასური და ერთიანი ხელშეკრულება:</w:t>
       </w:r>
       <w:r>
         <w:rPr>
@@ -7136,7 +7116,7 @@
           <w:color w:val="000000"/>
           <w:sz w:val="21"/>
         </w:rPr>
-        <w:t xml:space="preserve"> კანდიდატი გამოცდამდე უნაღდო ანგარიშსწორებით იხდის საგამოცდო საფასურს (350 ლარს) და აფორმებს საგამოცდო მომსახურების ხელშეკრულებას. გამოცდის დღეს კანდიდატი ვალდებულია გამოცხადდეს საგამოცდო ცენტრში სესიის დაწყებამდე </w:t>
+        <w:t xml:space="preserve"> კანდიდატი გამოცდამდე უნაღდო ანგარიშსწორებით იხდის საგამოცდო საფასურს (350 ლარს). გამოცდის დღეს კანდიდატი ვალდებულია გამოცხადდეს საგამოცდო ცენტრში სესიის დაწყებამდე </w:t>
       </w:r>
       <w:r>
         <w:rPr>
@@ -7156,7 +7136,7 @@
           <w:color w:val="000000"/>
           <w:sz w:val="21"/>
         </w:rPr>
-        <w:t xml:space="preserve"> რეგისტრაციისა და იდენტიფიკაციის გასავლელად.</w:t>
+        <w:t>, რათა ადგილზე გააფორმოს (ხელი მოაწეროს) ერთიანი საგამოცდო და სასერტიფიკაციო ხელშეკრულება (რომლის სასერტიფიკაციო ნაწილი დადებულია გადადებითი პირობით და ძალაში შედის მხოლოდ გამოცდის ჩაბარებისა და 3 000 ლარის გადახდის მომენტიდან) და გაიაროს რეგისტრაცია/იდენტიფიკაცია.</w:t>
       </w:r>
     </w:p>
     <w:p>
@@ -7248,7 +7228,7 @@
           <w:color w:val="000000"/>
           <w:sz w:val="21"/>
         </w:rPr>
-        <w:t xml:space="preserve"> ვადაში ინსტიტუტის დირექტორი იღებს სასერტიფიკაციო გადაწყვეტილებას და კანდიდატს უგზავნის ოფიციალურ შეტყობინებას: წარუმატებელი შედეგის შემთხვევაში — დასაბუთებულ უარს და გასაჩივრების/განმეორებითი გამოცდის წესს, ხოლო წარმატებით ჩაბარების შემთხვევაში — მინიჭებულ კატეგორიას, სერტიფიკატის საფასურის (3 000 ლარის) გადახდის რეკვიზიტებსა და სასერტიფიკაციო ხელშეკრულების გაფორმების წესს.</w:t>
+        <w:t xml:space="preserve"> ვადაში ინსტიტუტის დირექტორი იღებს სასერტიფიკაციო გადაწყვეტილებას და კანდიდატს უგზავნის ოფიციალურ შეტყობინებას: წარუმატებელი შედეგის შემთხვევაში — დასაბუთებულ უარს და გასაჩივრების/განმეორებითი გამოცდის წესს, ხოლო წარმატებით ჩაბარების შემთხვევაში — მინიჭებულ კატეგორიას და სერტიფიკატის გაცემის საფასურის (3 000 ლარის) გადახდის რეკვიზიტებს.</w:t>
       </w:r>
     </w:p>
     <w:p>
@@ -7274,7 +7254,7 @@
           <w:color w:val="000000"/>
           <w:sz w:val="21"/>
         </w:rPr>
-        <w:t>საფასურის გადახდა და სასერტიფიკაციო ხელშეკრულების გაფორმება:</w:t>
+        <w:t>სერტიფიკატის გაცემის საფასურის გადახდა:</w:t>
       </w:r>
       <w:r>
         <w:rPr>
@@ -7304,7 +7284,7 @@
           <w:color w:val="000000"/>
           <w:sz w:val="21"/>
         </w:rPr>
-        <w:t xml:space="preserve"> განმავლობაში. აღნიშნულ ვადაში კანდიდატი იხდის სერტიფიკატის გაცემის საფასურს (</w:t>
+        <w:t xml:space="preserve"> განმავლობაში. აღნიშნულ ვადაში კანდიდატი უნაღდო ანგარიშსწორებით იხდის სერტიფიკატის გაცემის საფასურს (</w:t>
       </w:r>
       <w:r>
         <w:rPr>
@@ -7324,7 +7304,7 @@
           <w:color w:val="000000"/>
           <w:sz w:val="21"/>
         </w:rPr>
-        <w:t>) და ინსტიტუტთან აფორმებს შესაბამისი კატეგორიის სასერტიფიკაციო ხელშეკრულებას (1-თვიანი ვადის გასვლის შემთხვევაში საგამოცდო შედეგი ძალას კარგავს და სერტიფიკატის მისაღებად საჭიროა გამოცდის ხელახლა ჩაბარება).</w:t>
+        <w:t>), რითაც იურიდიულ ძალაში შედის გამოცდის დღეს ხელმოწერილი ერთიანი ხელშეკრულების სასერტიფიკაციო ნაწილი (1-თვიანი ვადის გასვლის შემთხვევაში საგამოცდო შედეგი ძალას კარგავს და სერტიფიკატის მისაღებად საჭიროა გამოცდის ხელახლა ჩაბარება; ამასთან, დადგენილ ვადაში საგამოცდო შედეგზე აპელაციის წარდგენა აჩერებს აღნიშნული 1-თვიანი ვადის დინებას აპელაციაზე საბოლოო გადაწყვეტილების ოფიციალურ შეტყობინებამდე).</w:t>
       </w:r>
     </w:p>
     <w:p>
@@ -7360,7 +7340,7 @@
           <w:color w:val="000000"/>
           <w:sz w:val="21"/>
         </w:rPr>
-        <w:t xml:space="preserve"> სერტიფიკატის გაცემის საფასურის (3 000 ლარის) გადახდიდან და სასერტიფიკაციო ხელშეკრულების გაფორმებიდან არაუმეტეს </w:t>
+        <w:t xml:space="preserve"> სერტიფიკატის გაცემის საფასურის (3 000 ლარის) გადახდიდან არაუმეტეს </w:t>
       </w:r>
       <w:r>
         <w:rPr>
@@ -7473,7 +7453,7 @@
           <w:color w:val="000000"/>
           <w:sz w:val="21"/>
         </w:rPr>
-        <w:t xml:space="preserve">) აისახება სერტიფიკატის გაცემის საფასურის (3 000 ლარის) გადახდიდან და სასერტიფიკაციო ხელშეკრულების გაფორმებიდან არაუმეტეს </w:t>
+        <w:t xml:space="preserve">) აისახება სერტიფიკატის გაცემის საფასურის (3 000 ლარის) გადახდიდან არაუმეტეს </w:t>
       </w:r>
       <w:r>
         <w:rPr>
@@ -7493,7 +7473,7 @@
           <w:color w:val="000000"/>
           <w:sz w:val="21"/>
         </w:rPr>
-        <w:t xml:space="preserve"> ვადაში. გაცემული სერტიფიკატები წარმოადგენს ინსტიტუტის (სერტიფიკაციის ორგანოს) ექსკლუზიურ საკუთრებას (სსტ ისო/იეკ 17024 §9.4.7).</w:t>
+        <w:t xml:space="preserve"> ვადაში (გამოცდის დღეს ხელმოწერილი ერთიანი საგამოცდო და სასერტიფიკაციო ხელშეკრულების საფუძველზე). გაცემული სერტიფიკატები წარმოადგენს ინსტიტუტის (სერტიფიკაციის ორგანოს) ექსკლუზიურ საკუთრებას (სსტ ისო/იეკ 17024 §9.4.7).</w:t>
       </w:r>
     </w:p>
     <w:p>
@@ -7726,7 +7706,7 @@
           <w:color w:val="000000"/>
           <w:sz w:val="21"/>
         </w:rPr>
-        <w:t xml:space="preserve"> ვადით, რომელიც აითვლება მისი გაცემის თარიღიდან (№134 დადგენილებით დამტკიცებული წესის მე-2 მუხლის მე-3 პუნქტი). გარდამავალი პირობით (§2.5 — აკადემიური ხარისხის გარეშე) გაცემულ A და B კატეგორიის სერტიფიკატზე ვრცელდება §2.5 „ბ“ პუნქტითა და საგამონაკლისო ხელშეკრულებით (</w:t>
+        <w:t xml:space="preserve"> ვადით, რომელიც აითვლება მისი გაცემის თარიღიდან (№134 დადგენილებით დამტკიცებული წესის მე-2 მუხლის მე-3 პუნქტი). გარდამავალი პირობით (§2.5 — აკადემიური ხარისხის გარეშე) გაცემულ A და B კატეგორიის სერტიფიკატზე ვრცელდება §2.5 „ბ“ პუნქტითა და ერთიანი ხელშეკრულებით განსაზღვრული ორმაგი ვადის დათქმა (დიპლომის წარუდგენლობისას მოქმედებს </w:t>
       </w:r>
       <w:r>
         <w:rPr>
@@ -7736,7 +7716,7 @@
           <w:color w:val="000000"/>
           <w:sz w:val="21"/>
         </w:rPr>
-        <w:t>GIPC-CON-001 (გარდამავალი)</w:t>
+        <w:t>2029 წლის 1 იანვრამდე</w:t>
       </w:r>
       <w:r>
         <w:rPr>
@@ -7746,47 +7726,7 @@
           <w:color w:val="000000"/>
           <w:sz w:val="21"/>
         </w:rPr>
-        <w:t xml:space="preserve"> / </w:t>
-      </w:r>
-      <w:r>
-        <w:rPr>
-          <w:rFonts w:ascii="Sylfaen" w:hAnsi="Sylfaen" w:cs="Sylfaen" w:eastAsia="Sylfaen"/>
-          <w:b/>
-          <w:i w:val="0"/>
-          <w:color w:val="000000"/>
-          <w:sz w:val="21"/>
-        </w:rPr>
-        <w:t>GIPC-CON-002 (გარდამავალი)</w:t>
-      </w:r>
-      <w:r>
-        <w:rPr>
-          <w:rFonts w:ascii="Sylfaen" w:hAnsi="Sylfaen" w:cs="Sylfaen" w:eastAsia="Sylfaen"/>
-          <w:b w:val="0"/>
-          <w:i w:val="0"/>
-          <w:color w:val="000000"/>
-          <w:sz w:val="21"/>
-        </w:rPr>
-        <w:t xml:space="preserve">) განსაზღვრული ორმაგი ვადის დათქმა (დიპლომის წარუდგენლობისას მოქმედებს </w:t>
-      </w:r>
-      <w:r>
-        <w:rPr>
-          <w:rFonts w:ascii="Sylfaen" w:hAnsi="Sylfaen" w:cs="Sylfaen" w:eastAsia="Sylfaen"/>
-          <w:b/>
-          <w:i w:val="0"/>
-          <w:color w:val="000000"/>
-          <w:sz w:val="21"/>
-        </w:rPr>
-        <w:t>2029 წლის 1 იანვრამდე</w:t>
-      </w:r>
-      <w:r>
-        <w:rPr>
-          <w:rFonts w:ascii="Sylfaen" w:hAnsi="Sylfaen" w:cs="Sylfaen" w:eastAsia="Sylfaen"/>
-          <w:b w:val="0"/>
-          <w:i w:val="0"/>
-          <w:color w:val="000000"/>
-          <w:sz w:val="21"/>
-        </w:rPr>
-        <w:t xml:space="preserve"> ან კანონმდებლობით გადაწეულ ახალ გარდამავალ თარიღამდე, მაგრამ არაუმეტეს გაცემიდან 5 წლისა, ხოლო გარდამავალ ვადაში დიპლომის წარდგენისას — სრული 5-წლიანი ვადით). კანონმდებლობის არსებითი ცვლილებით გამოწვეული ვადამდელი რესერტიფიცირების შემთხვევაში განახლებული სერტიფიკატი მოქმედებს თავდაპირველი სერტიფიკატის დარჩენილი ვადით.</w:t>
+        <w:t xml:space="preserve"> ან კანონმდებლობით გადაწეულ ახალ გარდამავალ თარიღამდე, მაგრამ არაუმეტეს გაცემიდან 5 წლისა, ხოლო გარდამავალ ვადაში დიპლომის წარდგენისა და სტანდარტული რეჟიმის წინაპირობებთან შესაბამისობის დადასტურებისას — სრული 5-წლიანი ვადით). კანონმდებლობის არსებითი ცვლილებით გამოწვეული ვადამდელი რესერტიფიცირების შემთხვევაში განახლებული სერტიფიკატი მოქმედებს თავდაპირველი სერტიფიკატის დარჩენილი ვადით.</w:t>
       </w:r>
     </w:p>
     <w:p>
@@ -7871,7 +7811,7 @@
           <w:color w:val="000000"/>
           <w:sz w:val="21"/>
         </w:rPr>
-        <w:t>საჯარო რეესტრში (საქართველოს მთავრობის №134 დადგენილებით დამტკიცებული წესის მე-2 მუხლის მე-5 და მე-6 პუნქტების შესაბამისად) ქვეყნდება სერტიფიცირებული პირის სახელი, გვარი, ელფოსტა, რეგისტრაციის დრო, სერტიფიკატის უნიკალური კოდი, კვალიფიკაცია (კატეგორია და სფერო / სქემის იდენტიფიკაცია), მოქმედი პირობები და შეზღუდვები (ასეთის არსებობისას), სერტიფიკატის სტატუსი (მოქმედი, შეჩერებული, გაუქმებული / ვადაგასული), გაცემის თარიღი, ვადა (წელი) და მოქმედების ბოლო თარიღი, აგრეთვე ჩამოსატვირთი სახით თავად გაცემული სერტიფიკატი (რომელზეც მითითებულია მფლობელის პირადი ნომერი). სერტიფიცირებული პირის ტელეფონის ნომერი, საგამოცდო ქულები და პირადი საქმის დოკუმენტები საჯაროდ არ ქვეყნდება.</w:t>
+        <w:t>საჯარო რეესტრში (საქართველოს მთავრობის №134 დადგენილებით დამტკიცებული წესის მე-2 მუხლის მე-5 და მე-6 პუნქტებისა და ერთიანი ხელშეკრულების) ქვეყნდება სერტიფიცირებული პირის სახელი, გვარი, ელფოსტა, რეგისტრაციის დრო, სერტიფიკატის უნიკალური კოდი, კვალიფიკაცია (კატეგორია და სფერო / სქემის იდენტიფიკაცია), მოქმედი პირობები და შეზღუდვები (ასეთის არსებობისას), სერტიფიკატის სტატუსი (მოქმედი, შეჩერებული, გაუქმებული / ვადაგასული), გაცემის თარიღი, ვადა (წელი) და მოქმედების ბოლო თარიღი, აგრეთვე ჩამოსატვირთი სახით თავად გაცემული სერტიფიკატი (რომელზეც მითითებულია მფლობელის პირადი ნომერი). სერტიფიცირებული პირის ტელეფონის ნომერი, საგამოცდო ქულები და პირადი საქმის დოკუმენტები საჯაროდ არ ქვეყნდება.</w:t>
       </w:r>
     </w:p>
     <w:p>
@@ -8005,7 +7945,7 @@
           <w:color w:val="000000"/>
           <w:sz w:val="21"/>
         </w:rPr>
-        <w:t>ბ) პროფესიული ან სასერტიფიკაციო ხელშეკრულებით გათვალისწინებული ვალდებულების დარღვევის დადასტურება — შეჩერების შესახებ გადაწყვეტილებასა და შეჩერების კონკრეტულ ვადას დარღვევის ხასიათისა და სიმძიმის გათვალისწინებით განსაზღვრავს ინსტიტუტის დირექტორი.</w:t>
+        <w:t>ბ) პროფესიული ან საგამოცდო და სასერტიფიკაციო ხელშეკრულებით გათვალისწინებული ვალდებულების დარღვევის დადასტურება — შეჩერების შესახებ გადაწყვეტილებასა და შეჩერების კონკრეტულ ვადას დარღვევის ხასიათისა და სიმძიმის გათვალისწინებით განსაზღვრავს ინსტიტუტის დირექტორი.</w:t>
       </w:r>
     </w:p>
     <w:p>
@@ -8718,7 +8658,7 @@
           <w:color w:val="000000"/>
           <w:sz w:val="21"/>
         </w:rPr>
-        <w:t>გ) საგამოცდო საფასურის (350 ლარი) და ახალი სერტიფიკატის გაცემის საფასურის (3 000 ლარი) გადახდასა და ახალი სასერტიფიკაციო ხელშეკრულების გაფორმებას.</w:t>
+        <w:t>გ) საგამოცდო საფასურის (350 ლარი), გამოცდის დღეს ახალი ერთიანი საგამოცდო და სასერტიფიკაციო ხელშეკრულების გაფორმებასა და გამოცდის ჩაბარების შემდეგ ახალი სერტიფიკატის გაცემის საფასურის (3 000 ლარი) გადახდას.</w:t>
       </w:r>
     </w:p>
     <w:p>
@@ -8902,7 +8842,7 @@
           <w:color w:val="000000"/>
           <w:sz w:val="21"/>
         </w:rPr>
-        <w:t xml:space="preserve"> მოქმედ სერტიფიკატს. კატეგორიის ცვლილებისას ახალი კატეგორიის სერტიფიკატის გაცემისთანავე წინა კატეგორიის სერტიფიკატი უქმდება და ფორმდება ახალი კატეგორიის სასერტიფიკაციო ხელშეკრულება.</w:t>
+        <w:t xml:space="preserve"> მოქმედ სერტიფიკატს. კატეგორიის ცვლილებისას ახალი კატეგორიის სერტიფიკატის გაცემისთანავე წინა კატეგორიის სერტიფიკატი უქმდება და მოქმედებს ახალი კატეგორიის უფლება-მოვალეობები ერთიანი ხელშეკრულების შესაბამისად.</w:t>
       </w:r>
     </w:p>
     <w:p>
@@ -8975,7 +8915,7 @@
           <w:color w:val="000000"/>
           <w:sz w:val="21"/>
         </w:rPr>
-        <w:t xml:space="preserve">. ამ შემთხვევაში მოწმდება მხოლოდ სამიზნე კატეგორიის საკვალიფიკაციო წინაპირობებთან (განათლება და შესაბამისი სამუშაო/საექსპერტო გამოცდილება) შესაბამისობა, ფორმდება ახალი კატეგორიის სასერტიფიკაციო ხელშეკრულება და გადაიხდება სერტიფიკატის გაცემის საფასური. გამოცდის გარეშე კატეგორიის შეცვლისას ახალი სერტიფიკატი გაიცემა შეცვლილი (წინა) სერტიფიკატის </w:t>
+        <w:t xml:space="preserve">. ამ შემთხვევაში მოწმდება მხოლოდ სამიზნე კატეგორიის საკვალიფიკაციო წინაპირობებთან (განათლება და შესაბამისი სამუშაო/საექსპერტო გამოცდილება) შესაბამისობა და გადაიხდება სერტიფიკატის გაცემის საფასური (საგამოცდო და სასერტიფიკაციო ხელშეკრულების შესაბამისად). გამოცდის გარეშე კატეგორიის შეცვლისას ახალი სერტიფიკატი გაიცემა შეცვლილი (წინა) სერტიფიკატის </w:t>
       </w:r>
       <w:r>
         <w:rPr>

</xml_diff>